<commit_message>
Freeze Q1/Q2 and remove legacy v5
</commit_message>
<xml_diff>
--- a/解题库/完整论文/论文_第一二问.docx
+++ b/解题库/完整论文/论文_第一二问.docx
@@ -36,7 +36,7 @@
         <w:rPr>
           <w:rFonts w:hint="eastAsia"/>
         </w:rPr>
-        <w:t xml:space="preserve">针对题目给定的示向度误差区间，本文分别解决交会定位区域的直径计算与第二检测点选择。第一问将每次测向表示为两个半平面，先判别交集是否为空或无界，再枚举有效边界交点并计算最远顶点对。证明多边形的连续直径等于顶点对最大距离，给出直径圆覆盖的充要条件，并以实际可由测向约束构成的等边三角形说明覆盖一般不成立。第二问以“保证下一次能够接收信号，并使两次观测后精确位置集合的最坏直径最小”为准则，利用首次已收到信号产生的接收半径条件信息，严格推导四圆交集的通用候选区。通过一对不可区分源构造全域下界，将最优站位归结为二次方程的小根；再以解析局部论证和覆盖全部剩余示向度的整数区间证书给出相等上界。未截断首次扇形的两个连续全局最优点为相对首次示向度坐标下的</w:t>
+        <w:t xml:space="preserve">针对题目给定的示向度误差区间，本文分别解决交会定位区域的直径计算与第二检测点选择。第一问将每次测向表示为两个半平面，先判别交集是否为空或无界，再枚举有效边界交点并计算最远顶点对。证明多边形的连续直径等于顶点对最大距离，给出直径圆覆盖的充要条件，并以实际可由测向约束构成的等边三角形说明覆盖一般不成立。第二问的目标是在保证第二次接收或近距返回的前提下，最小化最终位置集合的最坏直径。利用首次已收到信号产生的接收半径条件信息，严格推导四圆交集的通用候选区。通过一对不可区分源构造全域下界，将最优站位归结为二次方程的小根；再以解析局部论证和覆盖全部剩余示向度的整数区间证书给出相等上界。未截断首次扇形的两个连续全局最优点为相对首次示向度坐标下的</w:t>
       </w:r>
       <w:r>
         <w:t xml:space="preserve"> </w:t>
@@ -3977,7 +3977,76 @@
         <w:rPr>
           <w:rFonts w:hint="eastAsia"/>
         </w:rPr>
-        <w:t xml:space="preserve">空集不报告“完美定位”；无界区域没有有限覆盖圆；单点的</w:t>
+        <w:t xml:space="preserve">对</w:t>
+      </w:r>
+      <w:r>
+        <w:t xml:space="preserve"> </w:t>
+      </w:r>
+      <w:r>
+        <w:rPr>
+          <w:rStyle w:val="VerbatimChar"/>
+        </w:rPr>
+        <w:t xml:space="preserve">status == 'empty'</w:t>
+      </w:r>
+      <w:r>
+        <w:t xml:space="preserve"> </w:t>
+      </w:r>
+      <w:r>
+        <w:rPr>
+          <w:rFonts w:hint="eastAsia"/>
+        </w:rPr>
+        <w:t xml:space="preserve">的空定位区域不定义直径圆覆盖指标，因此接口返回</w:t>
+      </w:r>
+      <w:r>
+        <w:t xml:space="preserve"> </w:t>
+      </w:r>
+      <w:r>
+        <w:rPr>
+          <w:rStyle w:val="VerbatimChar"/>
+        </w:rPr>
+        <w:t xml:space="preserve">D=None</w:t>
+      </w:r>
+      <w:r>
+        <w:t xml:space="preserve">、</w:t>
+      </w:r>
+      <w:r>
+        <w:rPr>
+          <w:rStyle w:val="VerbatimChar"/>
+        </w:rPr>
+        <w:t xml:space="preserve">radius=None</w:t>
+      </w:r>
+      <w:r>
+        <w:t xml:space="preserve">、</w:t>
+      </w:r>
+      <w:r>
+        <w:rPr>
+          <w:rStyle w:val="VerbatimChar"/>
+        </w:rPr>
+        <w:t xml:space="preserve">q=None</w:t>
+      </w:r>
+      <w:r>
+        <w:t xml:space="preserve"> </w:t>
+      </w:r>
+      <w:r>
+        <w:rPr>
+          <w:rFonts w:hint="eastAsia"/>
+        </w:rPr>
+        <w:t xml:space="preserve">和</w:t>
+      </w:r>
+      <w:r>
+        <w:t xml:space="preserve"> </w:t>
+      </w:r>
+      <w:r>
+        <w:rPr>
+          <w:rStyle w:val="VerbatimChar"/>
+        </w:rPr>
+        <w:t xml:space="preserve">diameter_circle_covers=None</w:t>
+      </w:r>
+      <w:r>
+        <w:rPr>
+          <w:rFonts w:hint="eastAsia"/>
+        </w:rPr>
+        <w:t xml:space="preserve">，且不进入覆盖率统计分母。无界区域没有有限覆盖圆；单点的</w:t>
       </w:r>
       <w:r>
         <w:t xml:space="preserve"> </w:t>
@@ -6683,7 +6752,7 @@
         <w:rPr>
           <w:rFonts w:hint="eastAsia"/>
         </w:rPr>
-        <w:t xml:space="preserve">本文选择先保证式(9)，再最小化两次观测后的最坏位置集合直径。对普通第二读数</w:t>
+        <w:t xml:space="preserve">本文的目标是在保证第二次接收或近距返回的前提下，最小化最终位置集合的最坏直径。对普通第二读数</w:t>
       </w:r>
       <w:r>
         <w:t xml:space="preserve"> </w:t>
@@ -7481,6 +7550,121 @@
       </m:oMath>
       <w:r>
         <w:t xml:space="preserve">。</w:t>
+      </w:r>
+    </w:p>
+    <w:p>
+      <w:pPr>
+        <w:pStyle w:val="BodyText"/>
+      </w:pPr>
+      <w:r>
+        <w:rPr>
+          <w:rFonts w:hint="eastAsia"/>
+        </w:rPr>
+        <w:t xml:space="preserve">对标准、未被目标区域</w:t>
+      </w:r>
+      <w:r>
+        <w:t xml:space="preserve"> </w:t>
+      </w:r>
+      <m:oMath>
+        <m:r>
+          <m:rPr>
+            <m:sty m:val="p"/>
+          </m:rPr>
+          <m:t>Ω</m:t>
+        </m:r>
+      </m:oMath>
+      <w:r>
+        <w:t xml:space="preserve"> </w:t>
+      </w:r>
+      <w:r>
+        <w:rPr>
+          <w:rFonts w:hint="eastAsia"/>
+        </w:rPr>
+        <w:t xml:space="preserve">截断的首次扇形</w:t>
+      </w:r>
+      <w:r>
+        <w:t xml:space="preserve"> </w:t>
+      </w:r>
+      <m:oMath>
+        <m:sSup>
+          <m:e>
+            <m:r>
+              <m:t>F</m:t>
+            </m:r>
+          </m:e>
+          <m:sup>
+            <m:r>
+              <m:t>0</m:t>
+            </m:r>
+          </m:sup>
+        </m:sSup>
+      </m:oMath>
+      <w:r>
+        <w:rPr>
+          <w:rFonts w:hint="eastAsia"/>
+        </w:rPr>
+        <w:t xml:space="preserve">，四圆交集是完整接收安全域的必要充分条件。对实际被</w:t>
+      </w:r>
+      <w:r>
+        <w:t xml:space="preserve"> </w:t>
+      </w:r>
+      <m:oMath>
+        <m:r>
+          <m:rPr>
+            <m:sty m:val="p"/>
+          </m:rPr>
+          <m:t>Ω</m:t>
+        </m:r>
+      </m:oMath>
+      <w:r>
+        <w:t xml:space="preserve"> </w:t>
+      </w:r>
+      <w:r>
+        <w:rPr>
+          <w:rFonts w:hint="eastAsia"/>
+        </w:rPr>
+        <w:t xml:space="preserve">截断的</w:t>
+      </w:r>
+      <w:r>
+        <w:t xml:space="preserve"> </w:t>
+      </w:r>
+      <m:oMath>
+        <m:sSub>
+          <m:e>
+            <m:r>
+              <m:t>F</m:t>
+            </m:r>
+          </m:e>
+          <m:sub>
+            <m:r>
+              <m:t>1</m:t>
+            </m:r>
+          </m:sub>
+        </m:sSub>
+        <m:r>
+          <m:rPr>
+            <m:sty m:val="p"/>
+          </m:rPr>
+          <m:t>⊂</m:t>
+        </m:r>
+        <m:sSup>
+          <m:e>
+            <m:r>
+              <m:t>F</m:t>
+            </m:r>
+          </m:e>
+          <m:sup>
+            <m:r>
+              <m:t>0</m:t>
+            </m:r>
+          </m:sup>
+        </m:sSup>
+      </m:oMath>
+      <w:r>
+        <w:rPr>
+          <w:rFonts w:hint="eastAsia"/>
+        </w:rPr>
+        <w:t xml:space="preserve">，该四圆交集仍是保证安全的通用充分域，但不一定是该具体状态的完整安全域。</w:t>
       </w:r>
     </w:p>
     <w:p>
@@ -17738,7 +17922,7 @@
           <w:b/>
           <w:bCs/>
         </w:rPr>
-        <w:t xml:space="preserve">158项通过</w:t>
+        <w:t xml:space="preserve">164项通过</w:t>
       </w:r>
       <w:r>
         <w:rPr>
@@ -18426,7 +18610,76 @@
         <w:rPr>
           <w:rFonts w:hint="eastAsia"/>
         </w:rPr>
-        <w:t xml:space="preserve">的一个场景产生无界纯交会区域，程序保留该状态，而非截成有限多边形。表中分位数明确仅针对有界区域；不是删掉观测失败后比较策略。固定同一组观测再添加约束时，交集只会缩小，因而直径不增；跨场景均值和覆盖率则依赖抽样分布，不能当成普适定理。</w:t>
+        <w:t xml:space="preserve">的一个场景产生无界纯交会区域，程序保留该状态，而非截成有限多边形。表中分位数明确仅针对有界区域；不是删掉观测失败后比较策略。覆盖率统计只对</w:t>
+      </w:r>
+      <w:r>
+        <w:t xml:space="preserve"> </w:t>
+      </w:r>
+      <w:r>
+        <w:rPr>
+          <w:rStyle w:val="VerbatimChar"/>
+        </w:rPr>
+        <w:t xml:space="preserve">point</w:t>
+      </w:r>
+      <w:r>
+        <w:t xml:space="preserve">、</w:t>
+      </w:r>
+      <w:r>
+        <w:rPr>
+          <w:rStyle w:val="VerbatimChar"/>
+        </w:rPr>
+        <w:t xml:space="preserve">segment</w:t>
+      </w:r>
+      <w:r>
+        <w:t xml:space="preserve">、</w:t>
+      </w:r>
+      <w:r>
+        <w:rPr>
+          <w:rStyle w:val="VerbatimChar"/>
+        </w:rPr>
+        <w:t xml:space="preserve">bounded</w:t>
+      </w:r>
+      <w:r>
+        <w:t xml:space="preserve"> </w:t>
+      </w:r>
+      <w:r>
+        <w:rPr>
+          <w:rFonts w:hint="eastAsia"/>
+        </w:rPr>
+        <w:t xml:space="preserve">这些有定义的定位区域计算；空定位区域的</w:t>
+      </w:r>
+      <w:r>
+        <w:t xml:space="preserve"> </w:t>
+      </w:r>
+      <w:r>
+        <w:rPr>
+          <w:rStyle w:val="VerbatimChar"/>
+        </w:rPr>
+        <w:t xml:space="preserve">None</w:t>
+      </w:r>
+      <w:r>
+        <w:t xml:space="preserve"> </w:t>
+      </w:r>
+      <w:r>
+        <w:rPr>
+          <w:rFonts w:hint="eastAsia"/>
+        </w:rPr>
+        <w:t xml:space="preserve">不转换为</w:t>
+      </w:r>
+      <w:r>
+        <w:t xml:space="preserve"> </w:t>
+      </w:r>
+      <w:r>
+        <w:rPr>
+          <w:rStyle w:val="VerbatimChar"/>
+        </w:rPr>
+        <w:t xml:space="preserve">False</w:t>
+      </w:r>
+      <w:r>
+        <w:rPr>
+          <w:rFonts w:hint="eastAsia"/>
+        </w:rPr>
+        <w:t xml:space="preserve">，无界区域也不进入覆盖率分母。固定同一组观测再添加约束时，交集只会缩小，因而直径不增；跨场景均值和覆盖率则依赖抽样分布，不能当成普适定理。</w:t>
       </w:r>
     </w:p>
     <w:bookmarkEnd w:id="42"/>
@@ -23823,7 +24076,7 @@
         <w:rPr>
           <w:rFonts w:hint="eastAsia"/>
         </w:rPr>
-        <w:t xml:space="preserve">保留根和坐标的严格区间、所有活动分支的检查值，以及全部角度叶区间。代码不是替代未给出的证明，而是执行本文已经明确列出的有限有理数不等式检查。相反，158项自动化测试和数值实验只说明实现通过了列明的测试，它们不承担上述定理的逻辑证明责任。</w:t>
+        <w:t xml:space="preserve">保留根和坐标的严格区间、所有活动分支的检查值，以及全部角度叶区间。代码不是替代未给出的证明，而是执行本文已经明确列出的有限有理数不等式检查。相反，164项自动化测试和数值实验只说明实现通过了列明的测试，它们不承担上述定理的逻辑证明责任。</w:t>
       </w:r>
     </w:p>
     <w:bookmarkEnd w:id="53"/>

</xml_diff>